<commit_message>
moisture flux for tables
</commit_message>
<xml_diff>
--- a/doc/Precipitation.docx
+++ b/doc/Precipitation.docx
@@ -351,6 +351,914 @@
           </wp:inline>
         </w:drawing>
       </w:r>
+    </w:p>
+    <w:p>
+      <w:pPr>
+        <w:spacing w:line="240" w:lineRule="auto"/>
+      </w:pPr>
+    </w:p>
+    <w:tbl>
+      <w:tblPr>
+        <w:tblW w:w="0" w:type="auto"/>
+        <w:tblCellSpacing w:w="15" w:type="dxa"/>
+        <w:tblCellMar>
+          <w:top w:w="15" w:type="dxa"/>
+          <w:left w:w="15" w:type="dxa"/>
+          <w:bottom w:w="15" w:type="dxa"/>
+          <w:right w:w="15" w:type="dxa"/>
+        </w:tblCellMar>
+        <w:tblLook w:val="04A0" w:firstRow="1" w:lastRow="0" w:firstColumn="1" w:lastColumn="0" w:noHBand="0" w:noVBand="1"/>
+      </w:tblPr>
+      <w:tblGrid>
+        <w:gridCol w:w="3060"/>
+        <w:gridCol w:w="1260"/>
+        <w:gridCol w:w="1530"/>
+        <w:gridCol w:w="1530"/>
+        <w:gridCol w:w="1530"/>
+      </w:tblGrid>
+      <w:tr>
+        <w:trPr>
+          <w:tblCellSpacing w:w="15" w:type="dxa"/>
+        </w:trPr>
+        <w:tc>
+          <w:tcPr>
+            <w:tcW w:w="3015" w:type="dxa"/>
+            <w:tcBorders>
+              <w:bottom w:val="single" w:sz="4" w:space="0" w:color="DCDFE5"/>
+            </w:tcBorders>
+            <w:hideMark/>
+          </w:tcPr>
+          <w:p>
+            <w:pPr>
+              <w:pStyle w:val="BodyText"/>
+              <w:spacing w:before="0" w:after="0"/>
+              <w:rPr>
+                <w:b/>
+                <w:bCs/>
+              </w:rPr>
+            </w:pPr>
+            <w:r>
+              <w:rPr>
+                <w:b/>
+                <w:bCs/>
+              </w:rPr>
+              <w:lastRenderedPageBreak/>
+              <w:t>experiment</w:t>
+            </w:r>
+          </w:p>
+        </w:tc>
+        <w:tc>
+          <w:tcPr>
+            <w:tcW w:w="1230" w:type="dxa"/>
+            <w:tcBorders>
+              <w:bottom w:val="single" w:sz="4" w:space="0" w:color="DCDFE5"/>
+            </w:tcBorders>
+            <w:vAlign w:val="center"/>
+            <w:hideMark/>
+          </w:tcPr>
+          <w:p>
+            <w:pPr>
+              <w:pStyle w:val="BodyText"/>
+              <w:spacing w:before="0" w:after="0"/>
+              <w:jc w:val="right"/>
+              <w:rPr>
+                <w:b/>
+                <w:bCs/>
+              </w:rPr>
+            </w:pPr>
+            <m:oMath>
+              <m:r>
+                <m:rPr>
+                  <m:sty m:val="b"/>
+                </m:rPr>
+                <w:rPr>
+                  <w:rFonts w:ascii="Cambria Math" w:hAnsi="Cambria Math"/>
+                </w:rPr>
+                <m:t>Δ</m:t>
+              </m:r>
+              <m:r>
+                <m:rPr>
+                  <m:sty m:val="bi"/>
+                </m:rPr>
+                <w:rPr>
+                  <w:rFonts w:ascii="Cambria Math" w:hAnsi="Cambria Math"/>
+                </w:rPr>
+                <m:t>M/</m:t>
+              </m:r>
+              <m:r>
+                <m:rPr>
+                  <m:sty m:val="bi"/>
+                </m:rPr>
+                <w:rPr>
+                  <w:rFonts w:ascii="Cambria Math" w:hAnsi="Cambria Math"/>
+                </w:rPr>
+                <m:t>M</m:t>
+              </m:r>
+            </m:oMath>
+            <w:r>
+              <w:rPr>
+                <w:rFonts w:eastAsiaTheme="minorEastAsia"/>
+                <w:b/>
+              </w:rPr>
+              <w:t xml:space="preserve"> </w:t>
+            </w:r>
+            <w:r>
+              <w:rPr>
+                <w:rFonts w:eastAsiaTheme="minorEastAsia"/>
+                <w:b/>
+              </w:rPr>
+              <w:br/>
+            </w:r>
+            <w:r>
+              <w:rPr>
+                <w:b/>
+                <w:bCs/>
+              </w:rPr>
+              <w:t>(%)</w:t>
+            </w:r>
+          </w:p>
+        </w:tc>
+        <w:tc>
+          <w:tcPr>
+            <w:tcW w:w="1500" w:type="dxa"/>
+            <w:tcBorders>
+              <w:bottom w:val="single" w:sz="4" w:space="0" w:color="DCDFE5"/>
+            </w:tcBorders>
+          </w:tcPr>
+          <w:p>
+            <w:pPr>
+              <w:pStyle w:val="BodyText"/>
+              <w:spacing w:before="0" w:after="0"/>
+              <w:jc w:val="right"/>
+              <w:rPr>
+                <w:rFonts w:ascii="Aptos Display" w:eastAsia="Times New Roman" w:hAnsi="Aptos Display" w:cs="Times New Roman"/>
+                <w:b/>
+                <w:color w:val="3A7C22" w:themeColor="accent6" w:themeShade="BF"/>
+              </w:rPr>
+            </w:pPr>
+            <m:oMath>
+              <m:r>
+                <m:rPr>
+                  <m:sty m:val="b"/>
+                </m:rPr>
+                <w:rPr>
+                  <w:rFonts w:ascii="Cambria Math" w:hAnsi="Cambria Math"/>
+                  <w:color w:val="3A7C22" w:themeColor="accent6" w:themeShade="BF"/>
+                </w:rPr>
+                <m:t>Δ</m:t>
+              </m:r>
+              <m:sSub>
+                <m:sSubPr>
+                  <m:ctrlPr>
+                    <w:rPr>
+                      <w:rFonts w:ascii="Cambria Math" w:hAnsi="Cambria Math"/>
+                      <w:b/>
+                      <w:i/>
+                      <w:iCs/>
+                      <w:color w:val="3A7C22" w:themeColor="accent6" w:themeShade="BF"/>
+                    </w:rPr>
+                  </m:ctrlPr>
+                </m:sSubPr>
+                <m:e>
+                  <m:r>
+                    <m:rPr>
+                      <m:sty m:val="bi"/>
+                    </m:rPr>
+                    <w:rPr>
+                      <w:rFonts w:ascii="Cambria Math" w:hAnsi="Cambria Math"/>
+                      <w:color w:val="3A7C22" w:themeColor="accent6" w:themeShade="BF"/>
+                    </w:rPr>
+                    <m:t>G</m:t>
+                  </m:r>
+                </m:e>
+                <m:sub>
+                  <m:r>
+                    <m:rPr>
+                      <m:sty m:val="bi"/>
+                    </m:rPr>
+                    <w:rPr>
+                      <w:rFonts w:ascii="Cambria Math" w:hAnsi="Cambria Math"/>
+                      <w:color w:val="3A7C22" w:themeColor="accent6" w:themeShade="BF"/>
+                    </w:rPr>
+                    <m:t>cld</m:t>
+                  </m:r>
+                </m:sub>
+              </m:sSub>
+              <m:r>
+                <m:rPr>
+                  <m:sty m:val="bi"/>
+                </m:rPr>
+                <w:rPr>
+                  <w:rFonts w:ascii="Cambria Math" w:hAnsi="Cambria Math"/>
+                  <w:color w:val="3A7C22" w:themeColor="accent6" w:themeShade="BF"/>
+                </w:rPr>
+                <m:t>/</m:t>
+              </m:r>
+              <m:sSub>
+                <m:sSubPr>
+                  <m:ctrlPr>
+                    <w:rPr>
+                      <w:rFonts w:ascii="Cambria Math" w:hAnsi="Cambria Math"/>
+                      <w:b/>
+                      <w:i/>
+                      <w:color w:val="3A7C22" w:themeColor="accent6" w:themeShade="BF"/>
+                    </w:rPr>
+                  </m:ctrlPr>
+                </m:sSubPr>
+                <m:e>
+                  <m:r>
+                    <m:rPr>
+                      <m:sty m:val="bi"/>
+                    </m:rPr>
+                    <w:rPr>
+                      <w:rFonts w:ascii="Cambria Math" w:hAnsi="Cambria Math"/>
+                      <w:color w:val="3A7C22" w:themeColor="accent6" w:themeShade="BF"/>
+                    </w:rPr>
+                    <m:t>G</m:t>
+                  </m:r>
+                </m:e>
+                <m:sub>
+                  <m:r>
+                    <m:rPr>
+                      <m:sty m:val="bi"/>
+                    </m:rPr>
+                    <w:rPr>
+                      <w:rFonts w:ascii="Cambria Math" w:hAnsi="Cambria Math"/>
+                      <w:color w:val="3A7C22" w:themeColor="accent6" w:themeShade="BF"/>
+                    </w:rPr>
+                    <m:t>cld</m:t>
+                  </m:r>
+                </m:sub>
+              </m:sSub>
+            </m:oMath>
+            <w:r>
+              <w:rPr>
+                <w:rFonts w:eastAsiaTheme="minorEastAsia"/>
+                <w:b/>
+                <w:color w:val="3A7C22" w:themeColor="accent6" w:themeShade="BF"/>
+              </w:rPr>
+              <w:t xml:space="preserve"> </w:t>
+            </w:r>
+            <w:r>
+              <w:rPr>
+                <w:rFonts w:eastAsiaTheme="minorEastAsia"/>
+                <w:b/>
+                <w:color w:val="3A7C22" w:themeColor="accent6" w:themeShade="BF"/>
+              </w:rPr>
+              <w:br/>
+            </w:r>
+            <w:r>
+              <w:rPr>
+                <w:b/>
+                <w:bCs/>
+                <w:color w:val="3A7C22" w:themeColor="accent6" w:themeShade="BF"/>
+              </w:rPr>
+              <w:t>(%)</w:t>
+            </w:r>
+          </w:p>
+        </w:tc>
+        <w:tc>
+          <w:tcPr>
+            <w:tcW w:w="1500" w:type="dxa"/>
+            <w:tcBorders>
+              <w:bottom w:val="single" w:sz="4" w:space="0" w:color="DCDFE5"/>
+            </w:tcBorders>
+          </w:tcPr>
+          <w:p>
+            <w:pPr>
+              <w:pStyle w:val="BodyText"/>
+              <w:spacing w:before="0" w:after="0"/>
+              <w:jc w:val="right"/>
+              <w:rPr>
+                <w:rFonts w:ascii="Aptos Display" w:eastAsia="Times New Roman" w:hAnsi="Aptos Display" w:cs="Times New Roman"/>
+                <w:b/>
+                <w:color w:val="3A7C22" w:themeColor="accent6" w:themeShade="BF"/>
+              </w:rPr>
+            </w:pPr>
+            <m:oMath>
+              <m:r>
+                <m:rPr>
+                  <m:sty m:val="b"/>
+                </m:rPr>
+                <w:rPr>
+                  <w:rFonts w:ascii="Cambria Math" w:hAnsi="Cambria Math"/>
+                  <w:color w:val="3A7C22" w:themeColor="accent6" w:themeShade="BF"/>
+                </w:rPr>
+                <m:t>Δ</m:t>
+              </m:r>
+              <m:sSub>
+                <m:sSubPr>
+                  <m:ctrlPr>
+                    <w:rPr>
+                      <w:rFonts w:ascii="Cambria Math" w:hAnsi="Cambria Math"/>
+                      <w:b/>
+                      <w:color w:val="3A7C22" w:themeColor="accent6" w:themeShade="BF"/>
+                    </w:rPr>
+                  </m:ctrlPr>
+                </m:sSubPr>
+                <m:e>
+                  <m:r>
+                    <m:rPr>
+                      <m:sty m:val="bi"/>
+                    </m:rPr>
+                    <w:rPr>
+                      <w:rFonts w:ascii="Cambria Math" w:hAnsi="Cambria Math"/>
+                      <w:color w:val="3A7C22" w:themeColor="accent6" w:themeShade="BF"/>
+                    </w:rPr>
+                    <m:t>G</m:t>
+                  </m:r>
+                </m:e>
+                <m:sub>
+                  <m:r>
+                    <m:rPr>
+                      <m:sty m:val="bi"/>
+                    </m:rPr>
+                    <w:rPr>
+                      <w:rFonts w:ascii="Cambria Math" w:hAnsi="Cambria Math"/>
+                      <w:color w:val="3A7C22" w:themeColor="accent6" w:themeShade="BF"/>
+                    </w:rPr>
+                    <m:t>pcp</m:t>
+                  </m:r>
+                </m:sub>
+              </m:sSub>
+              <m:r>
+                <m:rPr>
+                  <m:sty m:val="bi"/>
+                </m:rPr>
+                <w:rPr>
+                  <w:rFonts w:ascii="Cambria Math" w:hAnsi="Cambria Math"/>
+                  <w:color w:val="3A7C22" w:themeColor="accent6" w:themeShade="BF"/>
+                </w:rPr>
+                <m:t>/</m:t>
+              </m:r>
+              <m:sSub>
+                <m:sSubPr>
+                  <m:ctrlPr>
+                    <w:rPr>
+                      <w:rFonts w:ascii="Cambria Math" w:hAnsi="Cambria Math"/>
+                      <w:b/>
+                      <w:i/>
+                      <w:color w:val="3A7C22" w:themeColor="accent6" w:themeShade="BF"/>
+                    </w:rPr>
+                  </m:ctrlPr>
+                </m:sSubPr>
+                <m:e>
+                  <m:r>
+                    <m:rPr>
+                      <m:sty m:val="bi"/>
+                    </m:rPr>
+                    <w:rPr>
+                      <w:rFonts w:ascii="Cambria Math" w:hAnsi="Cambria Math"/>
+                      <w:color w:val="3A7C22" w:themeColor="accent6" w:themeShade="BF"/>
+                    </w:rPr>
+                    <m:t>G</m:t>
+                  </m:r>
+                </m:e>
+                <m:sub>
+                  <m:r>
+                    <m:rPr>
+                      <m:sty m:val="bi"/>
+                    </m:rPr>
+                    <w:rPr>
+                      <w:rFonts w:ascii="Cambria Math" w:hAnsi="Cambria Math"/>
+                      <w:color w:val="3A7C22" w:themeColor="accent6" w:themeShade="BF"/>
+                    </w:rPr>
+                    <m:t>pcp</m:t>
+                  </m:r>
+                </m:sub>
+              </m:sSub>
+            </m:oMath>
+            <w:r>
+              <w:rPr>
+                <w:rFonts w:eastAsiaTheme="minorEastAsia"/>
+                <w:b/>
+                <w:color w:val="3A7C22" w:themeColor="accent6" w:themeShade="BF"/>
+              </w:rPr>
+              <w:t xml:space="preserve"> </w:t>
+            </w:r>
+            <w:r>
+              <w:rPr>
+                <w:rFonts w:eastAsiaTheme="minorEastAsia"/>
+                <w:b/>
+                <w:color w:val="3A7C22" w:themeColor="accent6" w:themeShade="BF"/>
+              </w:rPr>
+              <w:br/>
+            </w:r>
+            <w:r>
+              <w:rPr>
+                <w:b/>
+                <w:bCs/>
+                <w:color w:val="3A7C22" w:themeColor="accent6" w:themeShade="BF"/>
+              </w:rPr>
+              <w:t>(%)</w:t>
+            </w:r>
+          </w:p>
+        </w:tc>
+        <w:tc>
+          <w:tcPr>
+            <w:tcW w:w="1485" w:type="dxa"/>
+            <w:tcBorders>
+              <w:bottom w:val="single" w:sz="4" w:space="0" w:color="DCDFE5"/>
+            </w:tcBorders>
+          </w:tcPr>
+          <w:p>
+            <w:pPr>
+              <w:pStyle w:val="BodyText"/>
+              <w:spacing w:before="0" w:after="0"/>
+              <w:jc w:val="right"/>
+              <w:rPr>
+                <w:rFonts w:ascii="Aptos Display" w:eastAsia="Times New Roman" w:hAnsi="Aptos Display" w:cs="Times New Roman"/>
+                <w:b/>
+              </w:rPr>
+            </w:pPr>
+            <w:r>
+              <w:rPr>
+                <w:rFonts w:eastAsiaTheme="minorEastAsia"/>
+                <w:b/>
+              </w:rPr>
+              <w:t xml:space="preserve"> </w:t>
+            </w:r>
+            <w:r>
+              <w:rPr>
+                <w:rFonts w:eastAsiaTheme="minorEastAsia"/>
+                <w:b/>
+              </w:rPr>
+              <w:br/>
+            </w:r>
+          </w:p>
+        </w:tc>
+      </w:tr>
+      <w:tr>
+        <w:trPr>
+          <w:tblCellSpacing w:w="15" w:type="dxa"/>
+        </w:trPr>
+        <w:tc>
+          <w:tcPr>
+            <w:tcW w:w="3015" w:type="dxa"/>
+            <w:hideMark/>
+          </w:tcPr>
+          <w:p>
+            <w:pPr>
+              <w:pStyle w:val="BodyText"/>
+              <w:spacing w:before="0" w:after="0"/>
+            </w:pPr>
+            <w:r>
+              <w:t>subsidence-5%</w:t>
+            </w:r>
+            <w:r>
+              <w:t>, Ecb+2%</w:t>
+            </w:r>
+          </w:p>
+        </w:tc>
+        <w:tc>
+          <w:tcPr>
+            <w:tcW w:w="1230" w:type="dxa"/>
+            <w:hideMark/>
+          </w:tcPr>
+          <w:p>
+            <w:pPr>
+              <w:pStyle w:val="BodyText"/>
+              <w:spacing w:before="0" w:after="0"/>
+              <w:jc w:val="right"/>
+            </w:pPr>
+            <w:r>
+              <w:t>–</w:t>
+            </w:r>
+            <w:r>
+              <w:t>5</w:t>
+            </w:r>
+            <w:r>
+              <w:t>.00</w:t>
+            </w:r>
+          </w:p>
+        </w:tc>
+        <w:tc>
+          <w:tcPr>
+            <w:tcW w:w="1500" w:type="dxa"/>
+          </w:tcPr>
+          <w:p>
+            <w:pPr>
+              <w:pStyle w:val="BodyText"/>
+              <w:spacing w:before="0" w:after="0"/>
+              <w:jc w:val="right"/>
+              <w:rPr>
+                <w:color w:val="3A7C22" w:themeColor="accent6" w:themeShade="BF"/>
+              </w:rPr>
+            </w:pPr>
+            <w:r>
+              <w:rPr>
+                <w:color w:val="3A7C22" w:themeColor="accent6" w:themeShade="BF"/>
+              </w:rPr>
+              <w:t>–5.00</w:t>
+            </w:r>
+          </w:p>
+        </w:tc>
+        <w:tc>
+          <w:tcPr>
+            <w:tcW w:w="1500" w:type="dxa"/>
+          </w:tcPr>
+          <w:p>
+            <w:pPr>
+              <w:pStyle w:val="BodyText"/>
+              <w:spacing w:before="0" w:after="0"/>
+              <w:jc w:val="right"/>
+              <w:rPr>
+                <w:color w:val="3A7C22" w:themeColor="accent6" w:themeShade="BF"/>
+              </w:rPr>
+            </w:pPr>
+            <w:r>
+              <w:rPr>
+                <w:color w:val="3A7C22" w:themeColor="accent6" w:themeShade="BF"/>
+              </w:rPr>
+              <w:t>–</w:t>
+            </w:r>
+            <w:r>
+              <w:rPr>
+                <w:color w:val="3A7C22" w:themeColor="accent6" w:themeShade="BF"/>
+              </w:rPr>
+              <w:t>5.</w:t>
+            </w:r>
+            <w:r>
+              <w:rPr>
+                <w:color w:val="3A7C22" w:themeColor="accent6" w:themeShade="BF"/>
+              </w:rPr>
+              <w:t>0</w:t>
+            </w:r>
+            <w:r>
+              <w:rPr>
+                <w:color w:val="3A7C22" w:themeColor="accent6" w:themeShade="BF"/>
+              </w:rPr>
+              <w:t>0</w:t>
+            </w:r>
+          </w:p>
+        </w:tc>
+        <w:tc>
+          <w:tcPr>
+            <w:tcW w:w="1485" w:type="dxa"/>
+          </w:tcPr>
+          <w:p>
+            <w:pPr>
+              <w:pStyle w:val="BodyText"/>
+              <w:spacing w:before="0" w:after="0"/>
+              <w:jc w:val="right"/>
+            </w:pPr>
+          </w:p>
+        </w:tc>
+      </w:tr>
+      <w:tr>
+        <w:trPr>
+          <w:tblCellSpacing w:w="15" w:type="dxa"/>
+        </w:trPr>
+        <w:tc>
+          <w:tcPr>
+            <w:tcW w:w="3015" w:type="dxa"/>
+            <w:hideMark/>
+          </w:tcPr>
+          <w:p>
+            <w:pPr>
+              <w:pStyle w:val="BodyText"/>
+              <w:spacing w:before="0" w:after="0"/>
+            </w:pPr>
+            <w:r>
+              <w:t>DIM (</w:t>
+            </w:r>
+            <w:r>
+              <w:t>q&amp;qs+7%</w:t>
+            </w:r>
+            <w:r>
+              <w:t>)</w:t>
+            </w:r>
+          </w:p>
+        </w:tc>
+        <w:tc>
+          <w:tcPr>
+            <w:tcW w:w="1230" w:type="dxa"/>
+            <w:hideMark/>
+          </w:tcPr>
+          <w:p>
+            <w:pPr>
+              <w:pStyle w:val="BodyText"/>
+              <w:spacing w:before="0" w:after="0"/>
+              <w:jc w:val="right"/>
+            </w:pPr>
+            <w:r>
+              <w:t>–</w:t>
+            </w:r>
+            <w:r>
+              <w:t>7.</w:t>
+            </w:r>
+            <w:r>
+              <w:t>74</w:t>
+            </w:r>
+          </w:p>
+        </w:tc>
+        <w:tc>
+          <w:tcPr>
+            <w:tcW w:w="1500" w:type="dxa"/>
+          </w:tcPr>
+          <w:p>
+            <w:pPr>
+              <w:pStyle w:val="BodyText"/>
+              <w:spacing w:before="0" w:after="0"/>
+              <w:jc w:val="right"/>
+              <w:rPr>
+                <w:color w:val="3A7C22" w:themeColor="accent6" w:themeShade="BF"/>
+              </w:rPr>
+            </w:pPr>
+            <w:r>
+              <w:rPr>
+                <w:color w:val="3A7C22" w:themeColor="accent6" w:themeShade="BF"/>
+              </w:rPr>
+              <w:t>–1.28</w:t>
+            </w:r>
+          </w:p>
+        </w:tc>
+        <w:tc>
+          <w:tcPr>
+            <w:tcW w:w="1500" w:type="dxa"/>
+          </w:tcPr>
+          <w:p>
+            <w:pPr>
+              <w:pStyle w:val="BodyText"/>
+              <w:spacing w:before="0" w:after="0"/>
+              <w:jc w:val="right"/>
+              <w:rPr>
+                <w:color w:val="3A7C22" w:themeColor="accent6" w:themeShade="BF"/>
+              </w:rPr>
+            </w:pPr>
+            <w:r>
+              <w:rPr>
+                <w:color w:val="3A7C22" w:themeColor="accent6" w:themeShade="BF"/>
+              </w:rPr>
+              <w:t>–0.7</w:t>
+            </w:r>
+            <w:r>
+              <w:rPr>
+                <w:color w:val="3A7C22" w:themeColor="accent6" w:themeShade="BF"/>
+              </w:rPr>
+              <w:t>5</w:t>
+            </w:r>
+          </w:p>
+        </w:tc>
+        <w:tc>
+          <w:tcPr>
+            <w:tcW w:w="1485" w:type="dxa"/>
+          </w:tcPr>
+          <w:p>
+            <w:pPr>
+              <w:pStyle w:val="BodyText"/>
+              <w:spacing w:before="0" w:after="0"/>
+              <w:jc w:val="right"/>
+            </w:pPr>
+          </w:p>
+        </w:tc>
+      </w:tr>
+      <w:tr>
+        <w:trPr>
+          <w:tblCellSpacing w:w="15" w:type="dxa"/>
+        </w:trPr>
+        <w:tc>
+          <w:tcPr>
+            <w:tcW w:w="3015" w:type="dxa"/>
+            <w:hideMark/>
+          </w:tcPr>
+          <w:p>
+            <w:pPr>
+              <w:pStyle w:val="BodyText"/>
+              <w:spacing w:before="0" w:after="0"/>
+            </w:pPr>
+            <w:r>
+              <w:t>lclRH+0.00</w:t>
+            </w:r>
+            <w:r>
+              <w:t>3</w:t>
+            </w:r>
+          </w:p>
+        </w:tc>
+        <w:tc>
+          <w:tcPr>
+            <w:tcW w:w="1230" w:type="dxa"/>
+            <w:hideMark/>
+          </w:tcPr>
+          <w:p>
+            <w:pPr>
+              <w:pStyle w:val="BodyText"/>
+              <w:spacing w:before="0" w:after="0"/>
+              <w:jc w:val="right"/>
+            </w:pPr>
+          </w:p>
+        </w:tc>
+        <w:tc>
+          <w:tcPr>
+            <w:tcW w:w="1500" w:type="dxa"/>
+          </w:tcPr>
+          <w:p>
+            <w:pPr>
+              <w:pStyle w:val="BodyText"/>
+              <w:spacing w:before="0" w:after="0"/>
+              <w:jc w:val="right"/>
+              <w:rPr>
+                <w:color w:val="3A7C22" w:themeColor="accent6" w:themeShade="BF"/>
+              </w:rPr>
+            </w:pPr>
+          </w:p>
+        </w:tc>
+        <w:tc>
+          <w:tcPr>
+            <w:tcW w:w="1500" w:type="dxa"/>
+          </w:tcPr>
+          <w:p>
+            <w:pPr>
+              <w:pStyle w:val="BodyText"/>
+              <w:tabs>
+                <w:tab w:val="center" w:pos="735"/>
+                <w:tab w:val="right" w:pos="1470"/>
+              </w:tabs>
+              <w:spacing w:before="0" w:after="0"/>
+              <w:rPr>
+                <w:color w:val="3A7C22" w:themeColor="accent6" w:themeShade="BF"/>
+              </w:rPr>
+            </w:pPr>
+            <w:r>
+              <w:rPr>
+                <w:color w:val="3A7C22" w:themeColor="accent6" w:themeShade="BF"/>
+              </w:rPr>
+              <w:tab/>
+            </w:r>
+            <w:r>
+              <w:rPr>
+                <w:color w:val="3A7C22" w:themeColor="accent6" w:themeShade="BF"/>
+              </w:rPr>
+              <w:tab/>
+            </w:r>
+          </w:p>
+        </w:tc>
+        <w:tc>
+          <w:tcPr>
+            <w:tcW w:w="1485" w:type="dxa"/>
+          </w:tcPr>
+          <w:p>
+            <w:pPr>
+              <w:pStyle w:val="BodyText"/>
+              <w:spacing w:before="0" w:after="0"/>
+              <w:jc w:val="right"/>
+            </w:pPr>
+          </w:p>
+        </w:tc>
+      </w:tr>
+      <w:tr>
+        <w:trPr>
+          <w:tblCellSpacing w:w="15" w:type="dxa"/>
+        </w:trPr>
+        <w:tc>
+          <w:tcPr>
+            <w:tcW w:w="3015" w:type="dxa"/>
+          </w:tcPr>
+          <w:p>
+            <w:pPr>
+              <w:pStyle w:val="BodyText"/>
+              <w:spacing w:before="0" w:after="0"/>
+            </w:pPr>
+          </w:p>
+        </w:tc>
+        <w:tc>
+          <w:tcPr>
+            <w:tcW w:w="1230" w:type="dxa"/>
+          </w:tcPr>
+          <w:p>
+            <w:pPr>
+              <w:pStyle w:val="BodyText"/>
+              <w:spacing w:before="0" w:after="0"/>
+              <w:jc w:val="right"/>
+            </w:pPr>
+          </w:p>
+        </w:tc>
+        <w:tc>
+          <w:tcPr>
+            <w:tcW w:w="1500" w:type="dxa"/>
+          </w:tcPr>
+          <w:p>
+            <w:pPr>
+              <w:pStyle w:val="BodyText"/>
+              <w:spacing w:before="0" w:after="0"/>
+              <w:jc w:val="right"/>
+              <w:rPr>
+                <w:color w:val="3A7C22" w:themeColor="accent6" w:themeShade="BF"/>
+              </w:rPr>
+            </w:pPr>
+          </w:p>
+        </w:tc>
+        <w:tc>
+          <w:tcPr>
+            <w:tcW w:w="1500" w:type="dxa"/>
+          </w:tcPr>
+          <w:p>
+            <w:pPr>
+              <w:pStyle w:val="BodyText"/>
+              <w:spacing w:before="0" w:after="0"/>
+              <w:jc w:val="right"/>
+              <w:rPr>
+                <w:color w:val="3A7C22" w:themeColor="accent6" w:themeShade="BF"/>
+              </w:rPr>
+            </w:pPr>
+          </w:p>
+        </w:tc>
+        <w:tc>
+          <w:tcPr>
+            <w:tcW w:w="1485" w:type="dxa"/>
+          </w:tcPr>
+          <w:p>
+            <w:pPr>
+              <w:pStyle w:val="BodyText"/>
+              <w:spacing w:before="0" w:after="0"/>
+              <w:jc w:val="right"/>
+            </w:pPr>
+          </w:p>
+        </w:tc>
+      </w:tr>
+      <w:tr>
+        <w:trPr>
+          <w:tblCellSpacing w:w="15" w:type="dxa"/>
+        </w:trPr>
+        <w:tc>
+          <w:tcPr>
+            <w:tcW w:w="3015" w:type="dxa"/>
+          </w:tcPr>
+          <w:p>
+            <w:pPr>
+              <w:pStyle w:val="BodyText"/>
+              <w:spacing w:before="0" w:after="0"/>
+            </w:pPr>
+          </w:p>
+        </w:tc>
+        <w:tc>
+          <w:tcPr>
+            <w:tcW w:w="1230" w:type="dxa"/>
+          </w:tcPr>
+          <w:p>
+            <w:pPr>
+              <w:pStyle w:val="BodyText"/>
+              <w:spacing w:before="0" w:after="0"/>
+              <w:jc w:val="right"/>
+            </w:pPr>
+          </w:p>
+        </w:tc>
+        <w:tc>
+          <w:tcPr>
+            <w:tcW w:w="1500" w:type="dxa"/>
+          </w:tcPr>
+          <w:p>
+            <w:pPr>
+              <w:pStyle w:val="BodyText"/>
+              <w:spacing w:before="0" w:after="0"/>
+              <w:jc w:val="right"/>
+              <w:rPr>
+                <w:color w:val="3A7C22" w:themeColor="accent6" w:themeShade="BF"/>
+              </w:rPr>
+            </w:pPr>
+          </w:p>
+        </w:tc>
+        <w:tc>
+          <w:tcPr>
+            <w:tcW w:w="1500" w:type="dxa"/>
+          </w:tcPr>
+          <w:p>
+            <w:pPr>
+              <w:pStyle w:val="BodyText"/>
+              <w:spacing w:before="0" w:after="0"/>
+              <w:jc w:val="right"/>
+              <w:rPr>
+                <w:color w:val="3A7C22" w:themeColor="accent6" w:themeShade="BF"/>
+              </w:rPr>
+            </w:pPr>
+          </w:p>
+        </w:tc>
+        <w:tc>
+          <w:tcPr>
+            <w:tcW w:w="1485" w:type="dxa"/>
+          </w:tcPr>
+          <w:p>
+            <w:pPr>
+              <w:pStyle w:val="BodyText"/>
+              <w:spacing w:before="0" w:after="0"/>
+              <w:jc w:val="right"/>
+            </w:pPr>
+          </w:p>
+        </w:tc>
+      </w:tr>
+    </w:tbl>
+    <w:p>
+      <w:pPr>
+        <w:pStyle w:val="BodyText"/>
+        <w:rPr>
+          <w:rFonts w:ascii="Aptos" w:hAnsi="Aptos"/>
+        </w:rPr>
+      </w:pPr>
+    </w:p>
+    <w:p>
+      <w:pPr>
+        <w:spacing w:line="240" w:lineRule="auto"/>
+      </w:pPr>
     </w:p>
     <w:sectPr>
       <w:pgSz w:w="12240" w:h="15840"/>
@@ -448,7 +1356,7 @@
     <w:lsdException w:name="Closing" w:semiHidden="1" w:unhideWhenUsed="1"/>
     <w:lsdException w:name="Signature" w:semiHidden="1" w:unhideWhenUsed="1"/>
     <w:lsdException w:name="Default Paragraph Font" w:semiHidden="1" w:uiPriority="1" w:unhideWhenUsed="1"/>
-    <w:lsdException w:name="Body Text" w:semiHidden="1" w:unhideWhenUsed="1"/>
+    <w:lsdException w:name="Body Text" w:semiHidden="1" w:uiPriority="0" w:unhideWhenUsed="1" w:qFormat="1"/>
     <w:lsdException w:name="Body Text Indent" w:semiHidden="1" w:unhideWhenUsed="1"/>
     <w:lsdException w:name="List Continue" w:semiHidden="1" w:unhideWhenUsed="1"/>
     <w:lsdException w:name="List Continue 2" w:semiHidden="1" w:unhideWhenUsed="1"/>
@@ -1288,6 +2196,30 @@
       <w:color w:val="666666"/>
     </w:rPr>
   </w:style>
+  <w:style w:type="paragraph" w:styleId="BodyText">
+    <w:name w:val="Body Text"/>
+    <w:basedOn w:val="Normal"/>
+    <w:link w:val="BodyTextChar"/>
+    <w:qFormat/>
+    <w:rsid w:val="00624DEB"/>
+    <w:pPr>
+      <w:spacing w:before="180" w:after="180" w:line="240" w:lineRule="auto"/>
+    </w:pPr>
+    <w:rPr>
+      <w:kern w:val="0"/>
+      <w14:ligatures w14:val="none"/>
+    </w:rPr>
+  </w:style>
+  <w:style w:type="character" w:customStyle="1" w:styleId="BodyTextChar">
+    <w:name w:val="Body Text Char"/>
+    <w:basedOn w:val="DefaultParagraphFont"/>
+    <w:link w:val="BodyText"/>
+    <w:rsid w:val="00624DEB"/>
+    <w:rPr>
+      <w:kern w:val="0"/>
+      <w14:ligatures w14:val="none"/>
+    </w:rPr>
+  </w:style>
 </w:styles>
 </file>
 

</xml_diff>